<commit_message>
Update resumes and delete old assets
</commit_message>
<xml_diff>
--- a/assets/cv/Dmitriy_Logunov_Resume.docx
+++ b/assets/cv/Dmitriy_Logunov_Resume.docx
@@ -793,7 +793,7 @@
           <w:szCs w:val="24"/>
           <w:rtl w:val="0"/>
         </w:rPr>
-        <w:t xml:space="preserve">TallBob had legacy software for the customer self-service portal, and the company was planning a rebrand and expansion of their business with the old system as the blocker. I was the key developer responsible for redesigning it into the modern web application, working in collaboration with the back-end developer and a junior front-end developer. The new portal increased existing-customer satisfaction, contributing to retention as well as bringing new clients in.</w:t>
+        <w:t xml:space="preserve">TallBob's customer self-service portal was legacy software blocking a planned rebrand and business expansion. I was the key developer responsible for redesigning it into the modern web application, working in collaboration with the back-end developer and a junior front-end developer. The new portal increased existing-customer satisfaction, contributing to retention as well as bringing new clients in.</w:t>
       </w:r>
     </w:p>
     <w:p>
@@ -1051,7 +1051,7 @@
           <w:szCs w:val="24"/>
           <w:rtl w:val="0"/>
         </w:rPr>
-        <w:t xml:space="preserve">I communicated with stakeholders and third-party vendors concerning development work on the Council website and other web properties, and managed development workflows both internally and with external vendors. I also performed in-house development: SASS styling of eCouncil application forms and BAU web development.</w:t>
+        <w:t xml:space="preserve">I managed development workflows for the Council website and other web properties, working with stakeholders and external vendors. I also performed in-house development: SASS styling of eCouncil application forms and BAU web development.</w:t>
       </w:r>
     </w:p>
     <w:p>
@@ -1180,7 +1180,7 @@
           <w:szCs w:val="24"/>
           <w:rtl w:val="0"/>
         </w:rPr>
-        <w:t xml:space="preserve">My role involved managing the Foundation’s web properties, communicating with third-party vendors, and implementing solutions in-house. I implemented PayPal integration into the Foundation’s donation forms and delivered multiple style and design changes. I monitored the Foundation’s websites through Pingdom and built-in hosting tools, and managed host records across all web properties.</w:t>
+        <w:t xml:space="preserve">My role involved managing the Foundation’s web properties, communicating with third-party vendors, and implementing solutions in-house. I implemented PayPal integration into the Foundation’s donation forms and delivered multiple style and design changes. </w:t>
       </w:r>
     </w:p>
     <w:p>
@@ -1309,7 +1309,7 @@
           <w:szCs w:val="24"/>
           <w:rtl w:val="0"/>
         </w:rPr>
-        <w:t xml:space="preserve">IE is a digital innovation agency working with clients including Telstra, Nike, Sportsgirl, Tourism Victoria, Crown, and Movember. I joined as a contractor to work on that year’s Movember platform release, and after completing the project was offered an extension. I worked across a range of projects including the following year’s Movember, and as a front-end developer through subcontract at Telstra Digital where I redesigned the in-store digital shopping experience.</w:t>
+        <w:t xml:space="preserve">I joined IE Digital - a digital innovation agency with clients including Telstra, Nike, and Movember - as a contractor on that year's Movember platform release, and after completing the project was offered an extension. I worked across a range of projects including the following year’s Movember, and as a front-end developer through subcontract at Telstra Digital where I redesigned the in-store digital shopping experience.</w:t>
       </w:r>
     </w:p>
     <w:p>
@@ -1340,85 +1340,6 @@
         <w:rPr>
           <w:rtl w:val="0"/>
         </w:rPr>
-      </w:r>
-    </w:p>
-    <w:p>
-      <w:pPr>
-        <w:spacing w:after="60" w:before="160" w:lineRule="auto"/>
-        <w:rPr>
-          <w:sz w:val="24"/>
-          <w:szCs w:val="24"/>
-        </w:rPr>
-      </w:pPr>
-      <w:r>
-        <w:rPr>
-          <w:b w:val="1"/>
-          <w:bCs w:val="1"/>
-          <w:sz w:val="26"/>
-          <w:szCs w:val="26"/>
-          <w:rtl w:val="0"/>
-        </w:rPr>
-        <w:t xml:space="preserve">Earlier roles</w:t>
-      </w:r>
-      <w:r>
-        <w:rPr>
-          <w:color w:val="555555"/>
-          <w:sz w:val="26"/>
-          <w:szCs w:val="26"/>
-          <w:rtl w:val="0"/>
-        </w:rPr>
-        <w:t xml:space="preserve"> – </w:t>
-      </w:r>
-      <w:r>
-        <w:rPr>
-          <w:b w:val="1"/>
-          <w:bCs w:val="1"/>
-          <w:sz w:val="26"/>
-          <w:szCs w:val="26"/>
-          <w:rtl w:val="0"/>
-        </w:rPr>
-        <w:t xml:space="preserve">Australia and overseas</w:t>
-      </w:r>
-      <w:r>
-        <w:rPr>
-          <w:sz w:val="24"/>
-          <w:szCs w:val="24"/>
-          <w:rtl w:val="0"/>
-        </w:rPr>
-        <w:t xml:space="preserve">   </w:t>
-      </w:r>
-      <w:r>
-        <w:rPr>
-          <w:i w:val="1"/>
-          <w:iCs w:val="1"/>
-          <w:color w:val="555555"/>
-          <w:sz w:val="24"/>
-          <w:szCs w:val="24"/>
-          <w:rtl w:val="0"/>
-        </w:rPr>
-        <w:t xml:space="preserve">Pre-2015</w:t>
-      </w:r>
-      <w:r>
-        <w:rPr>
-          <w:rtl w:val="0"/>
-        </w:rPr>
-      </w:r>
-    </w:p>
-    <w:p>
-      <w:pPr>
-        <w:spacing w:after="80" w:lineRule="auto"/>
-        <w:rPr>
-          <w:sz w:val="24"/>
-          <w:szCs w:val="24"/>
-        </w:rPr>
-      </w:pPr>
-      <w:r>
-        <w:rPr>
-          <w:sz w:val="24"/>
-          <w:szCs w:val="24"/>
-          <w:rtl w:val="0"/>
-        </w:rPr>
-        <w:t xml:space="preserve">Multiple contract roles spanning PHP development, infrastructure administration, and senior support engineering.</w:t>
       </w:r>
     </w:p>
     <w:p>

</xml_diff>